<commit_message>
Redo Resume for 2025
</commit_message>
<xml_diff>
--- a/documents/Mike Wester CL.docx
+++ b/documents/Mike Wester CL.docx
@@ -29,12 +29,20 @@
     <w:p>
       <w:pPr>
         <w:pStyle w:val="NormalWeb"/>
+        <w:rPr>
+          <w:rFonts w:ascii="Arial" w:hAnsi="Arial" w:cs="Arial"/>
+          <w:color w:val="222222"/>
+          <w:shd w:val="clear" w:color="auto" w:fill="FFFFFF"/>
+        </w:rPr>
       </w:pPr>
-      <w:proofErr w:type="spellStart"/>
-      <w:r>
-        <w:t>FinThrive</w:t>
-      </w:r>
-      <w:proofErr w:type="spellEnd"/>
+      <w:r>
+        <w:rPr>
+          <w:rFonts w:ascii="Arial" w:hAnsi="Arial" w:cs="Arial"/>
+          <w:color w:val="222222"/>
+          <w:shd w:val="clear" w:color="auto" w:fill="FFFFFF"/>
+        </w:rPr>
+        <w:t>OEC</w:t>
+      </w:r>
     </w:p>
     <w:p>
       <w:pPr>
@@ -43,11 +51,14 @@
       <w:r>
         <w:t xml:space="preserve">I am writing to express my interest in the Software Developer position at </w:t>
       </w:r>
-      <w:proofErr w:type="spellStart"/>
-      <w:r>
-        <w:t>FinThrive</w:t>
-      </w:r>
-      <w:proofErr w:type="spellEnd"/>
+      <w:r>
+        <w:rPr>
+          <w:rFonts w:ascii="Arial" w:hAnsi="Arial" w:cs="Arial"/>
+          <w:color w:val="222222"/>
+          <w:shd w:val="clear" w:color="auto" w:fill="FFFFFF"/>
+        </w:rPr>
+        <w:t>OEC</w:t>
+      </w:r>
       <w:r>
         <w:t xml:space="preserve">, as advertised. With extensive experience in Angular, TypeScript, C# and ASP.NET, alongside a proficiency in supporting characters like Jasmine, Jest, Karma, Azure, </w:t>
       </w:r>
@@ -92,11 +103,14 @@
       <w:r>
         <w:t xml:space="preserve">What excites me most about this opportunity is the chance to work on innovative projects that make a tangible impact on users' lives. I am passionate about delivering high-quality solutions and providing excellent customer service, and I believe that my skills and enthusiasm align perfectly with the values of </w:t>
       </w:r>
-      <w:proofErr w:type="spellStart"/>
-      <w:r>
-        <w:t>FinThrive</w:t>
-      </w:r>
-      <w:proofErr w:type="spellEnd"/>
+      <w:r>
+        <w:rPr>
+          <w:rFonts w:ascii="Arial" w:hAnsi="Arial" w:cs="Arial"/>
+          <w:color w:val="222222"/>
+          <w:shd w:val="clear" w:color="auto" w:fill="FFFFFF"/>
+        </w:rPr>
+        <w:t>OEC</w:t>
+      </w:r>
       <w:r>
         <w:t>.</w:t>
       </w:r>
@@ -108,11 +122,14 @@
       <w:r>
         <w:t xml:space="preserve">Thank you for considering my application. I am eager to bring my expertise to </w:t>
       </w:r>
-      <w:proofErr w:type="spellStart"/>
-      <w:r>
-        <w:t>FinThrive</w:t>
-      </w:r>
-      <w:proofErr w:type="spellEnd"/>
+      <w:r>
+        <w:rPr>
+          <w:rFonts w:ascii="Arial" w:hAnsi="Arial" w:cs="Arial"/>
+          <w:color w:val="222222"/>
+          <w:shd w:val="clear" w:color="auto" w:fill="FFFFFF"/>
+        </w:rPr>
+        <w:t>OEC</w:t>
+      </w:r>
       <w:r>
         <w:t xml:space="preserve"> </w:t>
       </w:r>

</xml_diff>

<commit_message>
Update Cover Letter 5/10/2026
</commit_message>
<xml_diff>
--- a/documents/Mike Wester CL.docx
+++ b/documents/Mike Wester CL.docx
@@ -7,24 +7,87 @@
         <w:pStyle w:val="NormalWeb"/>
       </w:pPr>
       <w:r>
-        <w:rPr>
-          <w:rStyle w:val="Strong"/>
-        </w:rPr>
-        <w:t>Mike Wester</w:t>
+        <w:t>Michael Wester</w:t>
       </w:r>
       <w:r>
         <w:br/>
-        <w:t>mpwester@gmail.com</w:t>
+      </w:r>
+      <w:r>
+        <w:t>(414) 380-3555</w:t>
       </w:r>
       <w:r>
         <w:br/>
-        <w:t>(414) 380 - 3555</w:t>
-      </w:r>
+      </w:r>
+      <w:hyperlink r:id="rId4" w:history="1">
+        <w:r>
+          <w:rPr>
+            <w:rStyle w:val="Hyperlink"/>
+          </w:rPr>
+          <w:t>mpw</w:t>
+        </w:r>
+        <w:r>
+          <w:rPr>
+            <w:rStyle w:val="Hyperlink"/>
+          </w:rPr>
+          <w:t>ester@gmail.com</w:t>
+        </w:r>
+      </w:hyperlink>
       <w:r>
         <w:br/>
       </w:r>
-      <w:r>
-        <w:t>Friday, February 13, 2026</w:t>
+      <w:hyperlink r:id="rId5" w:history="1">
+        <w:r>
+          <w:rPr>
+            <w:rStyle w:val="Hyperlink"/>
+          </w:rPr>
+          <w:t>L</w:t>
+        </w:r>
+        <w:r>
+          <w:rPr>
+            <w:rStyle w:val="Hyperlink"/>
+          </w:rPr>
+          <w:t>inked</w:t>
+        </w:r>
+        <w:r>
+          <w:rPr>
+            <w:rStyle w:val="Hyperlink"/>
+          </w:rPr>
+          <w:t>In</w:t>
+        </w:r>
+        <w:r>
+          <w:rPr>
+            <w:rStyle w:val="Hyperlink"/>
+          </w:rPr>
+          <w:t>.com/in/</w:t>
+        </w:r>
+        <w:r>
+          <w:rPr>
+            <w:rStyle w:val="Hyperlink"/>
+          </w:rPr>
+          <w:t>W</w:t>
+        </w:r>
+        <w:r>
+          <w:rPr>
+            <w:rStyle w:val="Hyperlink"/>
+          </w:rPr>
+          <w:t>ester-</w:t>
+        </w:r>
+        <w:r>
+          <w:rPr>
+            <w:rStyle w:val="Hyperlink"/>
+          </w:rPr>
+          <w:t>M</w:t>
+        </w:r>
+        <w:r>
+          <w:rPr>
+            <w:rStyle w:val="Hyperlink"/>
+          </w:rPr>
+          <w:t>ichael/</w:t>
+        </w:r>
+      </w:hyperlink>
+      <w:r>
+        <w:br/>
+        <w:t>[Date]</w:t>
       </w:r>
     </w:p>
     <w:p>
@@ -32,10 +95,11 @@
         <w:pStyle w:val="NormalWeb"/>
       </w:pPr>
       <w:r>
+        <w:t>Hiring Manager</w:t>
+      </w:r>
+      <w:r>
         <w:br/>
-      </w:r>
-      <w:r>
-        <w:t>&lt;REPLACE WITH COMPANY NAME&gt;</w:t>
+        <w:t>[Company Name]</w:t>
       </w:r>
     </w:p>
     <w:p>
@@ -43,27 +107,7 @@
         <w:pStyle w:val="NormalWeb"/>
       </w:pPr>
       <w:r>
-        <w:t xml:space="preserve">I am writing to express my interest in the </w:t>
-      </w:r>
-      <w:r>
-        <w:t xml:space="preserve">&lt;REPLACE WITH POSITION&gt; </w:t>
-      </w:r>
-      <w:r>
-        <w:t xml:space="preserve">position at </w:t>
-      </w:r>
-      <w:r>
-        <w:t>&lt;REPLACE WITH COMPANY NAME&gt;</w:t>
-      </w:r>
-      <w:r>
-        <w:t xml:space="preserve">, as advertised. With extensive experience in Angular, TypeScript, C# and ASP.NET, alongside a proficiency in supporting characters like Jasmine, Jest, Karma, Azure, </w:t>
-      </w:r>
-      <w:proofErr w:type="spellStart"/>
-      <w:r>
-        <w:t>Github</w:t>
-      </w:r>
-      <w:proofErr w:type="spellEnd"/>
-      <w:r>
-        <w:t xml:space="preserve"> Actions, I am confident in my ability to contribute effectively to your team.</w:t>
+        <w:t>Dear Hiring Manager,</w:t>
       </w:r>
     </w:p>
     <w:p>
@@ -71,7 +115,7 @@
         <w:pStyle w:val="NormalWeb"/>
       </w:pPr>
       <w:r>
-        <w:t>In my previous roles, I have successfully designed and implemented complex software solutions, always ensuring that the final product meets the highest standards of quality and usability. My experience with Single Sign-On (SSO) to create secure and seamless authentication experiences for users. I am comfortable interacting with both technical and non-technical stakeholders, ensuring that their needs are met with clear communication and tailored solutions.</w:t>
+        <w:t>I am writing to express my interest in opportunities with your organization. With experience in software development, web application design, and delivering scalable business solutions, I am confident in my ability to contribute effectively to your team.</w:t>
       </w:r>
     </w:p>
     <w:p>
@@ -79,13 +123,7 @@
         <w:pStyle w:val="NormalWeb"/>
       </w:pPr>
       <w:r>
-        <w:t xml:space="preserve">What excites me most about this opportunity is the chance to work on innovative projects that make a tangible impact on users' lives. I am passionate about delivering high-quality solutions and providing excellent customer service, and I believe that my skills and enthusiasm align perfectly with the values of </w:t>
-      </w:r>
-      <w:r>
-        <w:t>&lt;REPLACE WITH COMPANY NAME&gt;</w:t>
-      </w:r>
-      <w:r>
-        <w:t>.</w:t>
+        <w:t>My background includes developing and maintaining applications using technologies such as C#, ASP.NET, Angular, TypeScript, and SQL Server. I also have experience working with Microsoft Power Platform tools, including Power Apps and Power Automate, to streamline business processes and improve operational efficiency. In addition, I have worked with authentication and security solutions such as Azure B2C and Single Sign-On implementations.</w:t>
       </w:r>
     </w:p>
     <w:p>
@@ -93,13 +131,7 @@
         <w:pStyle w:val="NormalWeb"/>
       </w:pPr>
       <w:r>
-        <w:t xml:space="preserve">Thank you for considering my application. I am eager to bring my expertise to </w:t>
-      </w:r>
-      <w:r>
-        <w:t>&lt;REPLACE WITH COMPANY NAME&gt;</w:t>
-      </w:r>
-      <w:r>
-        <w:t xml:space="preserve"> and contribute to your continued success. I would welcome the opportunity to discuss how my background and skills could be a perfect fit for your team.</w:t>
+        <w:t>Throughout my career, I have focused on building reliable, user-friendly applications while collaborating closely with cross-functional teams and stakeholders. I take pride in writing clean, maintainable code, solving complex technical problems, and delivering high-quality solutions that meet both business and customer needs.</w:t>
       </w:r>
     </w:p>
     <w:p>
@@ -107,14 +139,32 @@
         <w:pStyle w:val="NormalWeb"/>
       </w:pPr>
       <w:r>
-        <w:t>Sincerely,</w:t>
+        <w:t>Beyond technical skills, I bring strong communication abilities, adaptability, and a commitment to continuous learning. I enjoy working in collaborative environments where innovation, teamwork, and professional growth are encouraged.</w:t>
       </w:r>
     </w:p>
     <w:p>
+      <w:pPr>
+        <w:pStyle w:val="NormalWeb"/>
+      </w:pPr>
+      <w:r>
+        <w:t>I would welcome the opportunity to discuss how my experience and skills align with your team’s needs. Thank you for your time and consideration. I look forward to hearing from you.</w:t>
+      </w:r>
+    </w:p>
+    <w:p>
+      <w:pPr>
+        <w:pStyle w:val="NormalWeb"/>
+      </w:pPr>
+      <w:r>
+        <w:t>Sincerely,</w:t>
+      </w:r>
+      <w:r>
+        <w:br/>
+      </w:r>
       <w:r>
         <w:t>Michael Wester</w:t>
       </w:r>
     </w:p>
+    <w:p/>
     <w:sectPr>
       <w:pgSz w:w="12240" w:h="15840"/>
       <w:pgMar w:top="1440" w:right="1440" w:bottom="1440" w:left="1440" w:header="720" w:footer="720" w:gutter="0"/>
@@ -576,6 +626,29 @@
       <w:bCs/>
     </w:rPr>
   </w:style>
+  <w:style w:type="character" w:styleId="Hyperlink">
+    <w:name w:val="Hyperlink"/>
+    <w:basedOn w:val="DefaultParagraphFont"/>
+    <w:uiPriority w:val="99"/>
+    <w:unhideWhenUsed/>
+    <w:rsid w:val="00C006C2"/>
+    <w:rPr>
+      <w:color w:val="0563C1" w:themeColor="hyperlink"/>
+      <w:u w:val="single"/>
+    </w:rPr>
+  </w:style>
+  <w:style w:type="character" w:styleId="UnresolvedMention">
+    <w:name w:val="Unresolved Mention"/>
+    <w:basedOn w:val="DefaultParagraphFont"/>
+    <w:uiPriority w:val="99"/>
+    <w:semiHidden/>
+    <w:unhideWhenUsed/>
+    <w:rsid w:val="00C006C2"/>
+    <w:rPr>
+      <w:color w:val="605E5C"/>
+      <w:shd w:val="clear" w:color="auto" w:fill="E1DFDD"/>
+    </w:rPr>
+  </w:style>
 </w:styles>
 </file>
 

</xml_diff>